<commit_message>
Proposal Rev 1: fix carried-over client names, validity wording and dates
- Section 11: the binding-commitment clause named the wrong company;
  it now reads RAZEEN REAL ESTATE COMPANY.
- Covering letter: 'support Orascom construction Saudi Arabia' was
  carried over from another proposal; now Razeen Real Estate Company.
- Covering letter: validity read 'Fifteen (30) days' against 'THIRTY
  (30) calendar days' in clause 10.1; now Thirty (30) days.
- Revision Rev 0 -> Rev 1; issue date, letter date, reference date and
  the AOC signature date set to 15/09/2026.

PDF re-exported from the corrected document.

Co-Authored-By: Claude Opus 5 <noreply@anthropic.com>
Claude-Session: https://claude.ai/code/session_018YZPC1ASkubvmqtLu4xz4k
</commit_message>
<xml_diff>
--- a/AOC_Commercial_Proposal_Razeen_UPDATED.docx
+++ b/AOC_Commercial_Proposal_Razeen_UPDATED.docx
@@ -300,7 +300,7 @@
                 <w:szCs w:val="20"/>
                 <w:rtl/>
               </w:rPr>
-              <w:t>07</w:t>
+              <w:t>15</w:t>
             </w:r>
             <w:r>
               <w:rPr>
@@ -664,7 +664,7 @@
                 <w:sz w:val="20"/>
                 <w:szCs w:val="20"/>
               </w:rPr>
-              <w:t xml:space="preserve">Rev 0 </w:t>
+              <w:t xml:space="preserve">Rev 1 </w:t>
             </w:r>
           </w:p>
         </w:tc>
@@ -1608,7 +1608,7 @@
           <w:color w:val="8B6E2A"/>
           <w:rtl/>
         </w:rPr>
-        <w:t>07</w:t>
+        <w:t>15</w:t>
       </w:r>
       <w:r>
         <w:rPr>
@@ -1846,7 +1846,7 @@
           <w:iCs/>
           <w:color w:val="8B6E2A"/>
         </w:rPr>
-        <w:t>07</w:t>
+        <w:t>15</w:t>
       </w:r>
       <w:r>
         <w:rPr>
@@ -1937,10 +1937,10 @@
         <w:t xml:space="preserve">support </w:t>
       </w:r>
       <w:r>
-        <w:t>Orascom</w:t>
-      </w:r>
-      <w:r>
-        <w:t xml:space="preserve"> construction Saudi Arabia</w:t>
+        <w:t>Razeen Real Estate Company</w:t>
+      </w:r>
+      <w:r>
+        <w:t xml:space="preserve"/>
       </w:r>
     </w:p>
     <w:p>
@@ -2164,7 +2164,7 @@
         <w:t xml:space="preserve">Our proposal is open for acceptance for a period of </w:t>
       </w:r>
       <w:r>
-        <w:t>Fifteen</w:t>
+        <w:t>Thirty</w:t>
       </w:r>
       <w:r>
         <w:t xml:space="preserve"> (</w:t>
@@ -10899,7 +10899,7 @@
         <w:t xml:space="preserve">This proposal becomes a binding commitment between AOC Contracting Company and </w:t>
       </w:r>
       <w:r>
-        <w:t>Ratnamani metals and tubes LTD.</w:t>
+        <w:t>RAZEEN REAL ESTATE COMPANY.</w:t>
       </w:r>
       <w:r>
         <w:rPr>
@@ -11095,7 +11095,7 @@
                 <w:sz w:val="20"/>
                 <w:szCs w:val="20"/>
               </w:rPr>
-              <w:t>16</w:t>
+              <w:t>15</w:t>
             </w:r>
             <w:r>
               <w:rPr>
@@ -11109,7 +11109,7 @@
                 <w:sz w:val="20"/>
                 <w:szCs w:val="20"/>
               </w:rPr>
-              <w:t>8</w:t>
+              <w:t>9</w:t>
             </w:r>
             <w:r>
               <w:rPr>

</xml_diff>